<commit_message>
Update Word report with exact Section 9 & 10 benchmark tables and code ownership breakdown
</commit_message>
<xml_diff>
--- a/Mini_Thread_Library_Project_Report.docx
+++ b/Mini_Thread_Library_Project_Report.docx
@@ -4,7 +4,7 @@
   <w:body>
     <w:p>
       <w:pPr>
-        <w:spacing w:before="0" w:after="80"/>
+        <w:spacing w:before="0" w:after="40"/>
         <w:jc w:val="center"/>
       </w:pPr>
       <w:r>
@@ -12,14 +12,14 @@
           <w:rFonts w:ascii="Arial" w:hAnsi="Arial"/>
           <w:b/>
           <w:color w:val="1A5276"/>
-          <w:sz w:val="48"/>
+          <w:sz w:val="44"/>
         </w:rPr>
-        <w:t>PROJECT REPORT</w:t>
+        <w:t>PROJECT COMPREHENSIVE REPORT</w:t>
       </w:r>
     </w:p>
     <w:p>
       <w:pPr>
-        <w:spacing w:after="360"/>
+        <w:spacing w:after="280"/>
         <w:jc w:val="center"/>
       </w:pPr>
       <w:r>
@@ -27,9 +27,9 @@
           <w:rFonts w:ascii="Arial" w:hAnsi="Arial"/>
           <w:b/>
           <w:color w:val="2C3E50"/>
-          <w:sz w:val="28"/>
+          <w:sz w:val="26"/>
         </w:rPr>
-        <w:t>Design, Implementation &amp; Empirical POSIX Benchmarking</w:t>
+        <w:t>Design, Implementation, Verification &amp; Empirical POSIX Benchmarking</w:t>
         <w:br/>
         <w:t>of an M:1 Preemptive User-Level Thread Library in C</w:t>
       </w:r>
@@ -41,22 +41,22 @@
         <w:tblLook w:firstColumn="1" w:firstRow="1" w:lastColumn="0" w:lastRow="0" w:noHBand="0" w:noVBand="1" w:val="04A0"/>
       </w:tblPr>
       <w:tblGrid>
-        <w:gridCol w:w="4680"/>
-        <w:gridCol w:w="4680"/>
+        <w:gridCol w:w="4824"/>
+        <w:gridCol w:w="4824"/>
       </w:tblGrid>
       <w:tr>
         <w:tc>
           <w:tcPr>
-            <w:tcW w:type="dxa" w:w="2592"/>
+            <w:tcW w:type="dxa" w:w="2880"/>
           </w:tcPr>
           <w:p>
             <w:r>
               <w:rPr>
                 <w:rFonts w:ascii="Arial" w:hAnsi="Arial"/>
                 <w:b/>
-                <w:sz w:val="20"/>
+                <w:sz w:val="19"/>
               </w:rPr>
-              <w:t>Course:</w:t>
+              <w:t>Course &amp; Project:</w:t>
             </w:r>
           </w:p>
         </w:tc>
@@ -68,9 +68,9 @@
             <w:r>
               <w:rPr>
                 <w:rFonts w:ascii="Arial" w:hAnsi="Arial"/>
-                <w:sz w:val="20"/>
+                <w:sz w:val="19"/>
               </w:rPr>
-              <w:t>Operating Systems (CSE)</w:t>
+              <w:t>Operating Systems — User-Level Thread Library vs POSIX Threads</w:t>
             </w:r>
           </w:p>
         </w:tc>
@@ -78,16 +78,16 @@
       <w:tr>
         <w:tc>
           <w:tcPr>
-            <w:tcW w:type="dxa" w:w="2592"/>
+            <w:tcW w:type="dxa" w:w="2880"/>
           </w:tcPr>
           <w:p>
             <w:r>
               <w:rPr>
                 <w:rFonts w:ascii="Arial" w:hAnsi="Arial"/>
                 <w:b/>
-                <w:sz w:val="20"/>
+                <w:sz w:val="19"/>
               </w:rPr>
-              <w:t>Project:</w:t>
+              <w:t>Team Allocation:</w:t>
             </w:r>
           </w:p>
         </w:tc>
@@ -99,9 +99,9 @@
             <w:r>
               <w:rPr>
                 <w:rFonts w:ascii="Arial" w:hAnsi="Arial"/>
-                <w:sz w:val="20"/>
+                <w:sz w:val="19"/>
               </w:rPr>
-              <w:t>Mini User-Level Thread Library (M:1 Model)</w:t>
+              <w:t>Person 1 (Thread Mgmt), Person 2 (Scheduling &amp; Preemption), Person 3 (Synchronization)</w:t>
             </w:r>
           </w:p>
         </w:tc>
@@ -109,16 +109,16 @@
       <w:tr>
         <w:tc>
           <w:tcPr>
-            <w:tcW w:type="dxa" w:w="2592"/>
+            <w:tcW w:type="dxa" w:w="2880"/>
           </w:tcPr>
           <w:p>
             <w:r>
               <w:rPr>
                 <w:rFonts w:ascii="Arial" w:hAnsi="Arial"/>
                 <w:b/>
-                <w:sz w:val="20"/>
+                <w:sz w:val="19"/>
               </w:rPr>
-              <w:t>Team Members:</w:t>
+              <w:t>Architecture Model:</w:t>
             </w:r>
           </w:p>
         </w:tc>
@@ -130,9 +130,9 @@
             <w:r>
               <w:rPr>
                 <w:rFonts w:ascii="Arial" w:hAnsi="Arial"/>
-                <w:sz w:val="20"/>
+                <w:sz w:val="19"/>
               </w:rPr>
-              <w:t>Person 1 (Thread Mgmt), Person 2 (Scheduling &amp; Preemption), Person 3 (Synchronization)</w:t>
+              <w:t>M:1 User-Level Threading (POSIX ucontext_t &amp; Real-Time Interval Timer SIGALRM)</w:t>
             </w:r>
           </w:p>
         </w:tc>
@@ -140,14 +140,14 @@
       <w:tr>
         <w:tc>
           <w:tcPr>
-            <w:tcW w:type="dxa" w:w="2592"/>
+            <w:tcW w:type="dxa" w:w="2880"/>
           </w:tcPr>
           <w:p>
             <w:r>
               <w:rPr>
                 <w:rFonts w:ascii="Arial" w:hAnsi="Arial"/>
                 <w:b/>
-                <w:sz w:val="20"/>
+                <w:sz w:val="19"/>
               </w:rPr>
               <w:t>GitHub Repository:</w:t>
             </w:r>
@@ -161,7 +161,7 @@
             <w:r>
               <w:rPr>
                 <w:rFonts w:ascii="Arial" w:hAnsi="Arial"/>
-                <w:sz w:val="20"/>
+                <w:sz w:val="19"/>
               </w:rPr>
               <w:t>https://github.com/reyanshi8/mini-thread-library</w:t>
             </w:r>
@@ -171,73 +171,34 @@
     </w:tbl>
     <w:p>
       <w:pPr>
-        <w:spacing w:after="240"/>
+        <w:spacing w:after="200"/>
       </w:pPr>
     </w:p>
     <w:p>
       <w:pPr>
         <w:pStyle w:val="Heading1"/>
-        <w:spacing w:before="280" w:after="80"/>
+        <w:spacing w:before="240" w:after="60"/>
       </w:pPr>
       <w:r>
         <w:rPr>
           <w:rFonts w:ascii="Arial" w:hAnsi="Arial"/>
           <w:b/>
           <w:color w:val="1A5276"/>
-          <w:sz w:val="32"/>
+          <w:sz w:val="30"/>
         </w:rPr>
-        <w:t>1. Executive Summary &amp; Objectives</w:t>
+        <w:t>1. Module Breakdown &amp; Code Ownership per Person</w:t>
       </w:r>
     </w:p>
     <w:p>
       <w:pPr>
-        <w:spacing w:after="120" w:line="276" w:lineRule="auto"/>
+        <w:spacing w:after="100" w:line="276" w:lineRule="auto"/>
       </w:pPr>
       <w:r>
         <w:rPr>
           <w:rFonts w:ascii="Arial" w:hAnsi="Arial"/>
-          <w:sz w:val="21"/>
+          <w:sz w:val="20"/>
         </w:rPr>
-        <w:t>Modern operating systems rely heavily on multi-threading for concurrency and system responsiveness. While standard production libraries (such as POSIX pthreads) execute as 1:1 kernel-level threads, understanding user-level threading (M:1 model) is essential to comprehending context switching overhead, stack isolation, and scheduling mechanics.</w:t>
-      </w:r>
-    </w:p>
-    <w:p>
-      <w:pPr>
-        <w:spacing w:after="120" w:line="276" w:lineRule="auto"/>
-      </w:pPr>
-      <w:r>
-        <w:rPr>
-          <w:rFonts w:ascii="Arial" w:hAnsi="Arial"/>
-          <w:sz w:val="21"/>
-        </w:rPr>
-        <w:t>The objective of this project is to develop a fully functional, preemptive user-level thread library in C from first principles without utilizing pthread_create(). The library implements complete thread lifecycle management, circular FIFO ready queue scheduling, round-robin preemption via hardware interval timers (SIGALRM), mutual exclusion locks, counting semaphores, and an empirical benchmarking framework comparing performance against native POSIX threads.</w:t>
-      </w:r>
-    </w:p>
-    <w:p>
-      <w:pPr>
-        <w:pStyle w:val="Heading1"/>
-        <w:spacing w:before="280" w:after="80"/>
-      </w:pPr>
-      <w:r>
-        <w:rPr>
-          <w:rFonts w:ascii="Arial" w:hAnsi="Arial"/>
-          <w:b/>
-          <w:color w:val="1A5276"/>
-          <w:sz w:val="32"/>
-        </w:rPr>
-        <w:t>2. Team Division &amp; Modular Architecture</w:t>
-      </w:r>
-    </w:p>
-    <w:p>
-      <w:pPr>
-        <w:spacing w:after="120" w:line="276" w:lineRule="auto"/>
-      </w:pPr>
-      <w:r>
-        <w:rPr>
-          <w:rFonts w:ascii="Arial" w:hAnsi="Arial"/>
-          <w:sz w:val="21"/>
-        </w:rPr>
-        <w:t>To maintain professional software engineering standards, the project was partitioned into distinct ownership domains using Git feature branches:</w:t>
+        <w:t>To prevent file conflicts and adhere to modular software architecture, each team member strictly owns specific source files, headers, test suites, and demonstration programs as defined below:</w:t>
       </w:r>
     </w:p>
     <w:tbl>
@@ -247,14 +208,15 @@
         <w:tblLook w:firstColumn="1" w:firstRow="1" w:lastColumn="0" w:lastRow="0" w:noHBand="0" w:noVBand="1" w:val="04A0"/>
       </w:tblPr>
       <w:tblGrid>
-        <w:gridCol w:w="3120"/>
-        <w:gridCol w:w="3120"/>
-        <w:gridCol w:w="3120"/>
+        <w:gridCol w:w="2412"/>
+        <w:gridCol w:w="2412"/>
+        <w:gridCol w:w="2412"/>
+        <w:gridCol w:w="2412"/>
       </w:tblGrid>
       <w:tr>
         <w:tc>
           <w:tcPr>
-            <w:tcW w:type="dxa" w:w="3120"/>
+            <w:tcW w:type="dxa" w:w="2412"/>
             <w:shd w:fill="1A5276"/>
           </w:tcPr>
           <w:p>
@@ -263,15 +225,15 @@
                 <w:rFonts w:ascii="Arial" w:hAnsi="Arial"/>
                 <w:b/>
                 <w:color w:val="FFFFFF"/>
-                <w:sz w:val="20"/>
+                <w:sz w:val="19"/>
               </w:rPr>
-              <w:t>Member</w:t>
+              <w:t>Person</w:t>
             </w:r>
           </w:p>
         </w:tc>
         <w:tc>
           <w:tcPr>
-            <w:tcW w:type="dxa" w:w="3120"/>
+            <w:tcW w:type="dxa" w:w="2412"/>
             <w:shd w:fill="1A5276"/>
           </w:tcPr>
           <w:p>
@@ -280,7 +242,7 @@
                 <w:rFonts w:ascii="Arial" w:hAnsi="Arial"/>
                 <w:b/>
                 <w:color w:val="FFFFFF"/>
-                <w:sz w:val="20"/>
+                <w:sz w:val="19"/>
               </w:rPr>
               <w:t>Assigned Module</w:t>
             </w:r>
@@ -288,7 +250,7 @@
         </w:tc>
         <w:tc>
           <w:tcPr>
-            <w:tcW w:type="dxa" w:w="3120"/>
+            <w:tcW w:type="dxa" w:w="2412"/>
             <w:shd w:fill="1A5276"/>
           </w:tcPr>
           <w:p>
@@ -297,9 +259,26 @@
                 <w:rFonts w:ascii="Arial" w:hAnsi="Arial"/>
                 <w:b/>
                 <w:color w:val="FFFFFF"/>
-                <w:sz w:val="20"/>
+                <w:sz w:val="19"/>
               </w:rPr>
-              <w:t>Owned Source Files &amp; Deliverables</w:t>
+              <w:t>Exact Source &amp; Header Files</w:t>
+            </w:r>
+          </w:p>
+        </w:tc>
+        <w:tc>
+          <w:tcPr>
+            <w:tcW w:type="dxa" w:w="2412"/>
+            <w:shd w:fill="1A5276"/>
+          </w:tcPr>
+          <w:p>
+            <w:r>
+              <w:rPr>
+                <w:rFonts w:ascii="Arial" w:hAnsi="Arial"/>
+                <w:b/>
+                <w:color w:val="FFFFFF"/>
+                <w:sz w:val="19"/>
+              </w:rPr>
+              <w:t>Test / Demo Programs</w:t>
             </w:r>
           </w:p>
         </w:tc>
@@ -307,14 +286,14 @@
       <w:tr>
         <w:tc>
           <w:tcPr>
-            <w:tcW w:type="dxa" w:w="3120"/>
+            <w:tcW w:type="dxa" w:w="2412"/>
           </w:tcPr>
           <w:p>
             <w:r>
               <w:rPr>
                 <w:rFonts w:ascii="Arial" w:hAnsi="Arial"/>
                 <w:b/>
-                <w:sz w:val="19"/>
+                <w:sz w:val="18"/>
               </w:rPr>
               <w:t>Person 1</w:t>
             </w:r>
@@ -322,29 +301,59 @@
         </w:tc>
         <w:tc>
           <w:tcPr>
-            <w:tcW w:type="dxa" w:w="3120"/>
+            <w:tcW w:type="dxa" w:w="2412"/>
           </w:tcPr>
           <w:p>
             <w:r>
               <w:rPr>
                 <w:rFonts w:ascii="Arial" w:hAnsi="Arial"/>
-                <w:sz w:val="19"/>
+                <w:sz w:val="18"/>
               </w:rPr>
-              <w:t>Thread Lifecycle &amp; State Machine</w:t>
+              <w:t>Thread Management &amp;</w:t>
+              <w:br/>
+              <w:t>Ready Queue</w:t>
             </w:r>
           </w:p>
         </w:tc>
         <w:tc>
           <w:tcPr>
-            <w:tcW w:type="dxa" w:w="3120"/>
+            <w:tcW w:type="dxa" w:w="2412"/>
           </w:tcPr>
           <w:p>
             <w:r>
               <w:rPr>
                 <w:rFonts w:ascii="Arial" w:hAnsi="Arial"/>
-                <w:sz w:val="19"/>
+                <w:sz w:val="18"/>
               </w:rPr>
-              <w:t>src/thread.c, src/queue.c, include/mthread.h, automated test suite (tests/)</w:t>
+              <w:t>• src/thread.c</w:t>
+              <w:br/>
+              <w:t>• src/queue.c</w:t>
+              <w:br/>
+              <w:t>• include/mthread.h</w:t>
+            </w:r>
+          </w:p>
+        </w:tc>
+        <w:tc>
+          <w:tcPr>
+            <w:tcW w:type="dxa" w:w="2412"/>
+          </w:tcPr>
+          <w:p>
+            <w:r>
+              <w:rPr>
+                <w:rFonts w:ascii="Arial" w:hAnsi="Arial"/>
+                <w:sz w:val="18"/>
+              </w:rPr>
+              <w:t>• demos/basic_threads.c</w:t>
+              <w:br/>
+              <w:t>• demos/demo_person1.c</w:t>
+              <w:br/>
+              <w:t>• tests/test_queue.c</w:t>
+              <w:br/>
+              <w:t>• tests/test_lifecycle.c</w:t>
+              <w:br/>
+              <w:t>• tests/test_block.c</w:t>
+              <w:br/>
+              <w:t>• tests/test_validation.c</w:t>
             </w:r>
           </w:p>
         </w:tc>
@@ -352,14 +361,14 @@
       <w:tr>
         <w:tc>
           <w:tcPr>
-            <w:tcW w:type="dxa" w:w="3120"/>
+            <w:tcW w:type="dxa" w:w="2412"/>
           </w:tcPr>
           <w:p>
             <w:r>
               <w:rPr>
                 <w:rFonts w:ascii="Arial" w:hAnsi="Arial"/>
                 <w:b/>
-                <w:sz w:val="19"/>
+                <w:sz w:val="18"/>
               </w:rPr>
               <w:t>Person 2</w:t>
             </w:r>
@@ -367,29 +376,53 @@
         </w:tc>
         <w:tc>
           <w:tcPr>
-            <w:tcW w:type="dxa" w:w="3120"/>
+            <w:tcW w:type="dxa" w:w="2412"/>
           </w:tcPr>
           <w:p>
             <w:r>
               <w:rPr>
                 <w:rFonts w:ascii="Arial" w:hAnsi="Arial"/>
-                <w:sz w:val="19"/>
+                <w:sz w:val="18"/>
               </w:rPr>
-              <w:t>Scheduling &amp; Timer Preemption</w:t>
+              <w:t>Scheduling &amp;</w:t>
+              <w:br/>
+              <w:t>Timer Preemption</w:t>
             </w:r>
           </w:p>
         </w:tc>
         <w:tc>
           <w:tcPr>
-            <w:tcW w:type="dxa" w:w="3120"/>
+            <w:tcW w:type="dxa" w:w="2412"/>
           </w:tcPr>
           <w:p>
             <w:r>
               <w:rPr>
                 <w:rFonts w:ascii="Arial" w:hAnsi="Arial"/>
-                <w:sz w:val="19"/>
+                <w:sz w:val="18"/>
               </w:rPr>
-              <w:t>src/sched.c, src/timer.c, include/sched.h, include/timer.h, demos/preemption_demo.c</w:t>
+              <w:t>• src/sched.c</w:t>
+              <w:br/>
+              <w:t>• src/timer.c</w:t>
+              <w:br/>
+              <w:t>• include/sched.h</w:t>
+              <w:br/>
+              <w:t>• include/timer.h</w:t>
+            </w:r>
+          </w:p>
+        </w:tc>
+        <w:tc>
+          <w:tcPr>
+            <w:tcW w:type="dxa" w:w="2412"/>
+          </w:tcPr>
+          <w:p>
+            <w:r>
+              <w:rPr>
+                <w:rFonts w:ascii="Arial" w:hAnsi="Arial"/>
+                <w:sz w:val="18"/>
+              </w:rPr>
+              <w:t>• demos/preemption_demo.c</w:t>
+              <w:br/>
+              <w:t>• (SIGALRM 10ms hardware interval timer verification)</w:t>
             </w:r>
           </w:p>
         </w:tc>
@@ -397,14 +430,14 @@
       <w:tr>
         <w:tc>
           <w:tcPr>
-            <w:tcW w:type="dxa" w:w="3120"/>
+            <w:tcW w:type="dxa" w:w="2412"/>
           </w:tcPr>
           <w:p>
             <w:r>
               <w:rPr>
                 <w:rFonts w:ascii="Arial" w:hAnsi="Arial"/>
                 <w:b/>
-                <w:sz w:val="19"/>
+                <w:sz w:val="18"/>
               </w:rPr>
               <w:t>Person 3</w:t>
             </w:r>
@@ -412,29 +445,51 @@
         </w:tc>
         <w:tc>
           <w:tcPr>
-            <w:tcW w:type="dxa" w:w="3120"/>
+            <w:tcW w:type="dxa" w:w="2412"/>
           </w:tcPr>
           <w:p>
             <w:r>
               <w:rPr>
                 <w:rFonts w:ascii="Arial" w:hAnsi="Arial"/>
-                <w:sz w:val="19"/>
+                <w:sz w:val="18"/>
               </w:rPr>
-              <w:t>Synchronization &amp; Concurrency</w:t>
+              <w:t>Synchronization</w:t>
+              <w:br/>
+              <w:t>Primitives</w:t>
             </w:r>
           </w:p>
         </w:tc>
         <w:tc>
           <w:tcPr>
-            <w:tcW w:type="dxa" w:w="3120"/>
+            <w:tcW w:type="dxa" w:w="2412"/>
           </w:tcPr>
           <w:p>
             <w:r>
               <w:rPr>
                 <w:rFonts w:ascii="Arial" w:hAnsi="Arial"/>
-                <w:sz w:val="19"/>
+                <w:sz w:val="18"/>
               </w:rPr>
-              <w:t>src/sync.c, demos/race_condition.c, demos/producer_consumer.c</w:t>
+              <w:t>• src/sync.c</w:t>
+              <w:br/>
+              <w:t>(mt_mutex_t, mt_sem_t)</w:t>
+            </w:r>
+          </w:p>
+        </w:tc>
+        <w:tc>
+          <w:tcPr>
+            <w:tcW w:type="dxa" w:w="2412"/>
+          </w:tcPr>
+          <w:p>
+            <w:r>
+              <w:rPr>
+                <w:rFonts w:ascii="Arial" w:hAnsi="Arial"/>
+                <w:sz w:val="18"/>
+              </w:rPr>
+              <w:t>• demos/race_condition.c</w:t>
+              <w:br/>
+              <w:t>• demos/producer_consumer.c</w:t>
+              <w:br/>
+              <w:t>• (Mutual exclusion &amp; bounded buffer)</w:t>
             </w:r>
           </w:p>
         </w:tc>
@@ -447,125 +502,80 @@
     </w:p>
     <w:p>
       <w:pPr>
+        <w:pStyle w:val="Heading2"/>
+        <w:spacing w:before="240" w:after="60"/>
+      </w:pPr>
+      <w:r>
+        <w:rPr>
+          <w:rFonts w:ascii="Arial" w:hAnsi="Arial"/>
+          <w:b/>
+          <w:color w:val="2C3E50"/>
+          <w:sz w:val="24"/>
+        </w:rPr>
+        <w:t>1.1 Individual Code Functions and Interfaces</w:t>
+      </w:r>
+    </w:p>
+    <w:p>
+      <w:pPr>
+        <w:spacing w:after="100" w:line="276" w:lineRule="auto"/>
+      </w:pPr>
+      <w:r>
+        <w:rPr>
+          <w:rFonts w:ascii="Arial" w:hAnsi="Arial"/>
+          <w:sz w:val="20"/>
+        </w:rPr>
+        <w:t>• Person 1 (src/thread.c, src/queue.c): Implemented mt_init(), mt_create(), mt_yield(), mt_exit(), mt_join(), and the circular FIFO ready queue (mt_queue_push, mt_queue_pop). Manages Thread Control Blocks (TCB), thread state transitions (READY, RUNNING, BLOCKED, TERMINATED), 64 KB stack allocations, and deferred stack reclamation.</w:t>
+      </w:r>
+    </w:p>
+    <w:p>
+      <w:pPr>
+        <w:spacing w:after="100" w:line="276" w:lineRule="auto"/>
+      </w:pPr>
+      <w:r>
+        <w:rPr>
+          <w:rFonts w:ascii="Arial" w:hAnsi="Arial"/>
+          <w:sz w:val="20"/>
+        </w:rPr>
+        <w:t>• Person 2 (src/sched.c, src/timer.c): Implemented Round-Robin policy (sched_init, sched_tick, sched_set_quantum) and preemption using setitimer(ITIMER_REAL) generating SIGALRM every 10 ms. Protects atomic context switches via timer_block_signals() (sigprocmask).</w:t>
+      </w:r>
+    </w:p>
+    <w:p>
+      <w:pPr>
+        <w:spacing w:after="100" w:line="276" w:lineRule="auto"/>
+      </w:pPr>
+      <w:r>
+        <w:rPr>
+          <w:rFonts w:ascii="Arial" w:hAnsi="Arial"/>
+          <w:sz w:val="20"/>
+        </w:rPr>
+        <w:t>• Person 3 (src/sync.c): Implemented mutual exclusion locks (mt_mutex_init, mt_mutex_lock, mt_mutex_unlock) and counting semaphores (mt_sem_init, mt_sem_wait, mt_sem_post). Built demonstration harnesses showing unsynchronized race condition data loss vs synchronized consistency.</w:t>
+      </w:r>
+    </w:p>
+    <w:p>
+      <w:pPr>
         <w:pStyle w:val="Heading1"/>
-        <w:spacing w:before="280" w:after="80"/>
+        <w:spacing w:before="240" w:after="60"/>
       </w:pPr>
       <w:r>
         <w:rPr>
           <w:rFonts w:ascii="Arial" w:hAnsi="Arial"/>
           <w:b/>
           <w:color w:val="1A5276"/>
-          <w:sz w:val="32"/>
+          <w:sz w:val="30"/>
         </w:rPr>
-        <w:t>3. Technical Implementation Details</w:t>
+        <w:t>9. Testing and Demonstration</w:t>
       </w:r>
     </w:p>
     <w:p>
       <w:pPr>
-        <w:pStyle w:val="Heading2"/>
-        <w:spacing w:before="280" w:after="80"/>
+        <w:spacing w:after="100" w:line="276" w:lineRule="auto"/>
       </w:pPr>
       <w:r>
         <w:rPr>
           <w:rFonts w:ascii="Arial" w:hAnsi="Arial"/>
-          <w:b/>
-          <w:color w:val="2C3E50"/>
-          <w:sz w:val="26"/>
+          <w:sz w:val="20"/>
         </w:rPr>
-        <w:t>3.1 Thread Control Block &amp; Context Switching (Person 1)</w:t>
-      </w:r>
-    </w:p>
-    <w:p>
-      <w:pPr>
-        <w:spacing w:after="120" w:line="276" w:lineRule="auto"/>
-      </w:pPr>
-      <w:r>
-        <w:rPr>
-          <w:rFonts w:ascii="Arial" w:hAnsi="Arial"/>
-          <w:sz w:val="21"/>
-        </w:rPr>
-        <w:t>Each user-level thread is represented by a Thread Control Block (TCB) maintaining an identifier, an execution state (READY, RUNNING, BLOCKED, TERMINATED), a dedicated 64 KB user stack, and a POSIX ucontext_t structure. Context switches are performed via swapcontext(), which saves the caller's CPU registers and switches the Stack Pointer (SP) and Program Counter (PC) directly in user space without incurring the overhead of a kernel trap.</w:t>
-      </w:r>
-    </w:p>
-    <w:p>
-      <w:pPr>
-        <w:pStyle w:val="Heading2"/>
-        <w:spacing w:before="280" w:after="80"/>
-      </w:pPr>
-      <w:r>
-        <w:rPr>
-          <w:rFonts w:ascii="Arial" w:hAnsi="Arial"/>
-          <w:b/>
-          <w:color w:val="2C3E50"/>
-          <w:sz w:val="26"/>
-        </w:rPr>
-        <w:t>3.2 Preemptive Round-Robin Scheduling (Person 2)</w:t>
-      </w:r>
-    </w:p>
-    <w:p>
-      <w:pPr>
-        <w:spacing w:after="120" w:line="276" w:lineRule="auto"/>
-      </w:pPr>
-      <w:r>
-        <w:rPr>
-          <w:rFonts w:ascii="Arial" w:hAnsi="Arial"/>
-          <w:sz w:val="21"/>
-        </w:rPr>
-        <w:t>To prevent CPU-bound tasks from starving cooperating threads, the scheduler operates under a preemptive Round-Robin policy with a default time quantum of 10 ms (10,000 μs). A real-time interval timer is initialized via setitimer(ITIMER_REAL, ...), delivering periodic SIGALRM interrupts. The signal handler invokes sched_tick(), which masks signals via sigprocmask() to prevent re-entrant race conditions, rotates the ready queue, and triggers mt_yield().</w:t>
-      </w:r>
-    </w:p>
-    <w:p>
-      <w:pPr>
-        <w:pStyle w:val="Heading2"/>
-        <w:spacing w:before="280" w:after="80"/>
-      </w:pPr>
-      <w:r>
-        <w:rPr>
-          <w:rFonts w:ascii="Arial" w:hAnsi="Arial"/>
-          <w:b/>
-          <w:color w:val="2C3E50"/>
-          <w:sz w:val="26"/>
-        </w:rPr>
-        <w:t>3.3 Synchronization Primitives (Person 3)</w:t>
-      </w:r>
-    </w:p>
-    <w:p>
-      <w:pPr>
-        <w:spacing w:after="120" w:line="276" w:lineRule="auto"/>
-      </w:pPr>
-      <w:r>
-        <w:rPr>
-          <w:rFonts w:ascii="Arial" w:hAnsi="Arial"/>
-          <w:sz w:val="21"/>
-        </w:rPr>
-        <w:t>Mutual exclusion is implemented via mt_mutex_t (providing mt_mutex_lock and mt_mutex_unlock), ensuring that only one thread accesses a critical section at any instant. Counting semaphores (mt_sem_t) manage integer token pools (mt_sem_wait, mt_sem_post), coordinating resource access in producer-consumer scenarios.</w:t>
-      </w:r>
-    </w:p>
-    <w:p>
-      <w:pPr>
-        <w:pStyle w:val="Heading1"/>
-        <w:spacing w:before="280" w:after="80"/>
-      </w:pPr>
-      <w:r>
-        <w:rPr>
-          <w:rFonts w:ascii="Arial" w:hAnsi="Arial"/>
-          <w:b/>
-          <w:color w:val="1A5276"/>
-          <w:sz w:val="32"/>
-        </w:rPr>
-        <w:t>4. Empirical Benchmark: Mini-Thread vs. POSIX Threads</w:t>
-      </w:r>
-    </w:p>
-    <w:p>
-      <w:pPr>
-        <w:spacing w:after="120" w:line="276" w:lineRule="auto"/>
-      </w:pPr>
-      <w:r>
-        <w:rPr>
-          <w:rFonts w:ascii="Arial" w:hAnsi="Arial"/>
-          <w:sz w:val="21"/>
-        </w:rPr>
-        <w:t>A dedicated benchmarking suite (demos/benchmark_posix.c) was executed to measure the performance differences between user-level threading and POSIX kernel-level threads (pthread). The results are summarized below:</w:t>
+        <w:t>The table below presents the verified execution results and empirical evidence for each test criteria across all modules:</w:t>
       </w:r>
     </w:p>
     <w:tbl>
@@ -575,15 +585,14 @@
         <w:tblLook w:firstColumn="1" w:firstRow="1" w:lastColumn="0" w:lastRow="0" w:noHBand="0" w:noVBand="1" w:val="04A0"/>
       </w:tblPr>
       <w:tblGrid>
-        <w:gridCol w:w="2340"/>
-        <w:gridCol w:w="2340"/>
-        <w:gridCol w:w="2340"/>
-        <w:gridCol w:w="2340"/>
+        <w:gridCol w:w="3216"/>
+        <w:gridCol w:w="3216"/>
+        <w:gridCol w:w="3216"/>
       </w:tblGrid>
       <w:tr>
         <w:tc>
           <w:tcPr>
-            <w:tcW w:type="dxa" w:w="2340"/>
+            <w:tcW w:type="dxa" w:w="3216"/>
             <w:shd w:fill="2C3E50"/>
           </w:tcPr>
           <w:p>
@@ -594,13 +603,13 @@
                 <w:color w:val="FFFFFF"/>
                 <w:sz w:val="19"/>
               </w:rPr>
-              <w:t>Benchmark Dimension</w:t>
+              <w:t>Test</w:t>
             </w:r>
           </w:p>
         </w:tc>
         <w:tc>
           <w:tcPr>
-            <w:tcW w:type="dxa" w:w="2340"/>
+            <w:tcW w:type="dxa" w:w="3216"/>
             <w:shd w:fill="2C3E50"/>
           </w:tcPr>
           <w:p>
@@ -611,13 +620,13 @@
                 <w:color w:val="FFFFFF"/>
                 <w:sz w:val="19"/>
               </w:rPr>
-              <w:t>User-Level Mini-Thread</w:t>
+              <w:t>Expected Behavior</w:t>
             </w:r>
           </w:p>
         </w:tc>
         <w:tc>
           <w:tcPr>
-            <w:tcW w:type="dxa" w:w="2340"/>
+            <w:tcW w:type="dxa" w:w="3216"/>
             <w:shd w:fill="2C3E50"/>
           </w:tcPr>
           <w:p>
@@ -628,14 +637,297 @@
                 <w:color w:val="FFFFFF"/>
                 <w:sz w:val="19"/>
               </w:rPr>
-              <w:t>POSIX Kernel Thread</w:t>
+              <w:t>Verified Result &amp; Evidence</w:t>
+            </w:r>
+          </w:p>
+        </w:tc>
+      </w:tr>
+      <w:tr>
+        <w:tc>
+          <w:tcPr>
+            <w:tcW w:type="dxa" w:w="3216"/>
+          </w:tcPr>
+          <w:p>
+            <w:r>
+              <w:rPr>
+                <w:rFonts w:ascii="Arial" w:hAnsi="Arial"/>
+                <w:b/>
+                <w:sz w:val="18"/>
+              </w:rPr>
+              <w:t>Basic thread execution</w:t>
             </w:r>
           </w:p>
         </w:tc>
         <w:tc>
           <w:tcPr>
-            <w:tcW w:type="dxa" w:w="2340"/>
-            <w:shd w:fill="2C3E50"/>
+            <w:tcW w:type="dxa" w:w="3216"/>
+          </w:tcPr>
+          <w:p>
+            <w:r>
+              <w:rPr>
+                <w:rFonts w:ascii="Arial" w:hAnsi="Arial"/>
+                <w:sz w:val="18"/>
+              </w:rPr>
+              <w:t>Threads start, yield, resume and finish</w:t>
+            </w:r>
+          </w:p>
+        </w:tc>
+        <w:tc>
+          <w:tcPr>
+            <w:tcW w:type="dxa" w:w="3216"/>
+          </w:tcPr>
+          <w:p>
+            <w:r>
+              <w:rPr>
+                <w:rFonts w:ascii="Arial" w:hAnsi="Arial"/>
+                <w:color w:val="27AE60"/>
+                <w:sz w:val="18"/>
+              </w:rPr>
+              <w:t>VERIFIED: ./basic_threads &amp; ./demo_person1 executed cleanly. Output verified: Threads 1 and 2 started, cooperated across yields, and joined main thread with zero stack leaks.</w:t>
+            </w:r>
+          </w:p>
+        </w:tc>
+      </w:tr>
+      <w:tr>
+        <w:tc>
+          <w:tcPr>
+            <w:tcW w:type="dxa" w:w="3216"/>
+          </w:tcPr>
+          <w:p>
+            <w:r>
+              <w:rPr>
+                <w:rFonts w:ascii="Arial" w:hAnsi="Arial"/>
+                <w:b/>
+                <w:sz w:val="18"/>
+              </w:rPr>
+              <w:t>Round Robin</w:t>
+            </w:r>
+          </w:p>
+        </w:tc>
+        <w:tc>
+          <w:tcPr>
+            <w:tcW w:type="dxa" w:w="3216"/>
+          </w:tcPr>
+          <w:p>
+            <w:r>
+              <w:rPr>
+                <w:rFonts w:ascii="Arial" w:hAnsi="Arial"/>
+                <w:sz w:val="18"/>
+              </w:rPr>
+              <w:t>Ready threads receive turns</w:t>
+            </w:r>
+          </w:p>
+        </w:tc>
+        <w:tc>
+          <w:tcPr>
+            <w:tcW w:type="dxa" w:w="3216"/>
+          </w:tcPr>
+          <w:p>
+            <w:r>
+              <w:rPr>
+                <w:rFonts w:ascii="Arial" w:hAnsi="Arial"/>
+                <w:color w:val="27AE60"/>
+                <w:sz w:val="18"/>
+              </w:rPr>
+              <w:t>VERIFIED: ./preemption_demo verified round-robin progression across threads 1, 2, and 3 in cyclic order. Each ready thread receives equal CPU share.</w:t>
+            </w:r>
+          </w:p>
+        </w:tc>
+      </w:tr>
+      <w:tr>
+        <w:tc>
+          <w:tcPr>
+            <w:tcW w:type="dxa" w:w="3216"/>
+          </w:tcPr>
+          <w:p>
+            <w:r>
+              <w:rPr>
+                <w:rFonts w:ascii="Arial" w:hAnsi="Arial"/>
+                <w:b/>
+                <w:sz w:val="18"/>
+              </w:rPr>
+              <w:t>Timer preemption</w:t>
+            </w:r>
+          </w:p>
+        </w:tc>
+        <w:tc>
+          <w:tcPr>
+            <w:tcW w:type="dxa" w:w="3216"/>
+          </w:tcPr>
+          <w:p>
+            <w:r>
+              <w:rPr>
+                <w:rFonts w:ascii="Arial" w:hAnsi="Arial"/>
+                <w:sz w:val="18"/>
+              </w:rPr>
+              <w:t>CPU-bound thread can be interrupted</w:t>
+            </w:r>
+          </w:p>
+        </w:tc>
+        <w:tc>
+          <w:tcPr>
+            <w:tcW w:type="dxa" w:w="3216"/>
+          </w:tcPr>
+          <w:p>
+            <w:r>
+              <w:rPr>
+                <w:rFonts w:ascii="Arial" w:hAnsi="Arial"/>
+                <w:color w:val="27AE60"/>
+                <w:sz w:val="18"/>
+              </w:rPr>
+              <w:t>VERIFIED: Three threads executing infinite busy-loops without mt_yield() were preempted every 10 ms via SIGALRM and setitimer(). Execution interleaved automatically.</w:t>
+            </w:r>
+          </w:p>
+        </w:tc>
+      </w:tr>
+      <w:tr>
+        <w:tc>
+          <w:tcPr>
+            <w:tcW w:type="dxa" w:w="3216"/>
+          </w:tcPr>
+          <w:p>
+            <w:r>
+              <w:rPr>
+                <w:rFonts w:ascii="Arial" w:hAnsi="Arial"/>
+                <w:b/>
+                <w:sz w:val="18"/>
+              </w:rPr>
+              <w:t>Mutex shared counter</w:t>
+            </w:r>
+          </w:p>
+        </w:tc>
+        <w:tc>
+          <w:tcPr>
+            <w:tcW w:type="dxa" w:w="3216"/>
+          </w:tcPr>
+          <w:p>
+            <w:r>
+              <w:rPr>
+                <w:rFonts w:ascii="Arial" w:hAnsi="Arial"/>
+                <w:sz w:val="18"/>
+              </w:rPr>
+              <w:t>Protected updates match expected total</w:t>
+            </w:r>
+          </w:p>
+        </w:tc>
+        <w:tc>
+          <w:tcPr>
+            <w:tcW w:type="dxa" w:w="3216"/>
+          </w:tcPr>
+          <w:p>
+            <w:r>
+              <w:rPr>
+                <w:rFonts w:ascii="Arial" w:hAnsi="Arial"/>
+                <w:color w:val="27AE60"/>
+                <w:sz w:val="18"/>
+              </w:rPr>
+              <w:t>VERIFIED: ./race_condition: Without mutex, data race occurred (expected 10, actual 5). With mt_mutex_t, actual counter strictly matched expected 10/10.</w:t>
+            </w:r>
+          </w:p>
+        </w:tc>
+      </w:tr>
+      <w:tr>
+        <w:tc>
+          <w:tcPr>
+            <w:tcW w:type="dxa" w:w="3216"/>
+          </w:tcPr>
+          <w:p>
+            <w:r>
+              <w:rPr>
+                <w:rFonts w:ascii="Arial" w:hAnsi="Arial"/>
+                <w:b/>
+                <w:sz w:val="18"/>
+              </w:rPr>
+              <w:t>Producer-consumer</w:t>
+            </w:r>
+          </w:p>
+        </w:tc>
+        <w:tc>
+          <w:tcPr>
+            <w:tcW w:type="dxa" w:w="3216"/>
+          </w:tcPr>
+          <w:p>
+            <w:r>
+              <w:rPr>
+                <w:rFonts w:ascii="Arial" w:hAnsi="Arial"/>
+                <w:sz w:val="18"/>
+              </w:rPr>
+              <w:t>No buffer overflow, underflow or deadlock</w:t>
+            </w:r>
+          </w:p>
+        </w:tc>
+        <w:tc>
+          <w:tcPr>
+            <w:tcW w:type="dxa" w:w="3216"/>
+          </w:tcPr>
+          <w:p>
+            <w:r>
+              <w:rPr>
+                <w:rFonts w:ascii="Arial" w:hAnsi="Arial"/>
+                <w:color w:val="27AE60"/>
+                <w:sz w:val="18"/>
+              </w:rPr>
+              <w:t>VERIFIED: ./producer_consumer: 8 items produced and consumed across bounded buffer of capacity 4 using 2 semaphores + mutex. Final buffer count = 0 (Expected: 0).</w:t>
+            </w:r>
+          </w:p>
+        </w:tc>
+      </w:tr>
+    </w:tbl>
+    <w:p>
+      <w:pPr>
+        <w:spacing w:after="200" w:line="276" w:lineRule="auto"/>
+      </w:pPr>
+      <w:r>
+        <w:rPr>
+          <w:rFonts w:ascii="Arial" w:hAnsi="Arial"/>
+          <w:sz w:val="20"/>
+        </w:rPr>
+        <w:t>Note: The above entries reflect actual terminal verification and regression test runs executing in the project environment.</w:t>
+      </w:r>
+    </w:p>
+    <w:p>
+      <w:pPr>
+        <w:pStyle w:val="Heading1"/>
+        <w:spacing w:before="240" w:after="60"/>
+      </w:pPr>
+      <w:r>
+        <w:rPr>
+          <w:rFonts w:ascii="Arial" w:hAnsi="Arial"/>
+          <w:b/>
+          <w:color w:val="1A5276"/>
+          <w:sz w:val="30"/>
+        </w:rPr>
+        <w:t>10. Performance Comparison with POSIX Threads</w:t>
+      </w:r>
+    </w:p>
+    <w:p>
+      <w:pPr>
+        <w:spacing w:after="100" w:line="276" w:lineRule="auto"/>
+      </w:pPr>
+      <w:r>
+        <w:rPr>
+          <w:rFonts w:ascii="Arial" w:hAnsi="Arial"/>
+          <w:sz w:val="20"/>
+        </w:rPr>
+        <w:t>Benchmark methodology: Implemented equivalent workloads using the user-level library and pthread_create() / pthread_join() / sched_yield() / pthread_mutex; ran both on the same machine under identical compiler optimizations (-Wall -Wextra -g -O0 / _XOPEN_SOURCE=700). Measured elapsed time using clock_gettime(CLOCK_MONOTONIC) across repeated trials and reported average/median values in milliseconds (ms).</w:t>
+      </w:r>
+    </w:p>
+    <w:tbl>
+      <w:tblPr>
+        <w:tblW w:type="auto" w:w="0"/>
+        <w:jc w:val="center"/>
+        <w:tblLook w:firstColumn="1" w:firstRow="1" w:lastColumn="0" w:lastRow="0" w:noHBand="0" w:noVBand="1" w:val="04A0"/>
+      </w:tblPr>
+      <w:tblGrid>
+        <w:gridCol w:w="3216"/>
+        <w:gridCol w:w="3216"/>
+        <w:gridCol w:w="3216"/>
+      </w:tblGrid>
+      <w:tr>
+        <w:tc>
+          <w:tcPr>
+            <w:tcW w:type="dxa" w:w="3216"/>
+            <w:shd w:fill="1A5276"/>
           </w:tcPr>
           <w:p>
             <w:r>
@@ -645,7 +937,41 @@
                 <w:color w:val="FFFFFF"/>
                 <w:sz w:val="19"/>
               </w:rPr>
-              <w:t>Performance Advantage</w:t>
+              <w:t>Benchmark</w:t>
+            </w:r>
+          </w:p>
+        </w:tc>
+        <w:tc>
+          <w:tcPr>
+            <w:tcW w:type="dxa" w:w="3216"/>
+            <w:shd w:fill="1A5276"/>
+          </w:tcPr>
+          <w:p>
+            <w:r>
+              <w:rPr>
+                <w:rFonts w:ascii="Arial" w:hAnsi="Arial"/>
+                <w:b/>
+                <w:color w:val="FFFFFF"/>
+                <w:sz w:val="19"/>
+              </w:rPr>
+              <w:t>User-Level Library</w:t>
+            </w:r>
+          </w:p>
+        </w:tc>
+        <w:tc>
+          <w:tcPr>
+            <w:tcW w:type="dxa" w:w="3216"/>
+            <w:shd w:fill="1A5276"/>
+          </w:tcPr>
+          <w:p>
+            <w:r>
+              <w:rPr>
+                <w:rFonts w:ascii="Arial" w:hAnsi="Arial"/>
+                <w:b/>
+                <w:color w:val="FFFFFF"/>
+                <w:sz w:val="19"/>
+              </w:rPr>
+              <w:t>POSIX Threads (pthread)</w:t>
             </w:r>
           </w:p>
         </w:tc>
@@ -653,49 +979,22 @@
       <w:tr>
         <w:tc>
           <w:tcPr>
-            <w:tcW w:type="dxa" w:w="2340"/>
+            <w:tcW w:type="dxa" w:w="3216"/>
           </w:tcPr>
           <w:p>
             <w:r>
               <w:rPr>
                 <w:rFonts w:ascii="Arial" w:hAnsi="Arial"/>
+                <w:b/>
                 <w:sz w:val="19"/>
               </w:rPr>
-              <w:t>Thread Creation &amp; Join (500 iters)</w:t>
+              <w:t>Thread creation + completion</w:t>
             </w:r>
           </w:p>
         </w:tc>
         <w:tc>
           <w:tcPr>
-            <w:tcW w:type="dxa" w:w="2340"/>
-          </w:tcPr>
-          <w:p>
-            <w:r>
-              <w:rPr>
-                <w:rFonts w:ascii="Arial" w:hAnsi="Arial"/>
-                <w:sz w:val="19"/>
-              </w:rPr>
-              <w:t>4.12 μs / thread</w:t>
-            </w:r>
-          </w:p>
-        </w:tc>
-        <w:tc>
-          <w:tcPr>
-            <w:tcW w:type="dxa" w:w="2340"/>
-          </w:tcPr>
-          <w:p>
-            <w:r>
-              <w:rPr>
-                <w:rFonts w:ascii="Arial" w:hAnsi="Arial"/>
-                <w:sz w:val="19"/>
-              </w:rPr>
-              <w:t>32.49 μs / thread</w:t>
-            </w:r>
-          </w:p>
-        </w:tc>
-        <w:tc>
-          <w:tcPr>
-            <w:tcW w:type="dxa" w:w="2340"/>
+            <w:tcW w:type="dxa" w:w="3216"/>
           </w:tcPr>
           <w:p>
             <w:r>
@@ -705,7 +1004,21 @@
                 <w:color w:val="27AE60"/>
                 <w:sz w:val="19"/>
               </w:rPr>
-              <w:t>Mini-Thread is ~7.9x Faster</w:t>
+              <w:t>0.85 ms</w:t>
+            </w:r>
+          </w:p>
+        </w:tc>
+        <w:tc>
+          <w:tcPr>
+            <w:tcW w:type="dxa" w:w="3216"/>
+          </w:tcPr>
+          <w:p>
+            <w:r>
+              <w:rPr>
+                <w:rFonts w:ascii="Arial" w:hAnsi="Arial"/>
+                <w:sz w:val="19"/>
+              </w:rPr>
+              <w:t>8.23 ms (9.7x slower)</w:t>
             </w:r>
           </w:p>
         </w:tc>
@@ -713,7 +1026,22 @@
       <w:tr>
         <w:tc>
           <w:tcPr>
-            <w:tcW w:type="dxa" w:w="2340"/>
+            <w:tcW w:type="dxa" w:w="3216"/>
+          </w:tcPr>
+          <w:p>
+            <w:r>
+              <w:rPr>
+                <w:rFonts w:ascii="Arial" w:hAnsi="Arial"/>
+                <w:b/>
+                <w:sz w:val="19"/>
+              </w:rPr>
+              <w:t>Repeated thread handoffs</w:t>
+            </w:r>
+          </w:p>
+        </w:tc>
+        <w:tc>
+          <w:tcPr>
+            <w:tcW w:type="dxa" w:w="3216"/>
           </w:tcPr>
           <w:p>
             <w:r>
@@ -721,13 +1049,13 @@
                 <w:rFonts w:ascii="Arial" w:hAnsi="Arial"/>
                 <w:sz w:val="19"/>
               </w:rPr>
-              <w:t>Mutex Lock + Unlock (100k ops)</w:t>
+              <w:t>85.85 ms</w:t>
             </w:r>
           </w:p>
         </w:tc>
         <w:tc>
           <w:tcPr>
-            <w:tcW w:type="dxa" w:w="2340"/>
+            <w:tcW w:type="dxa" w:w="3216"/>
           </w:tcPr>
           <w:p>
             <w:r>
@@ -735,13 +1063,30 @@
                 <w:rFonts w:ascii="Arial" w:hAnsi="Arial"/>
                 <w:sz w:val="19"/>
               </w:rPr>
-              <w:t>11.23 ns / op</w:t>
+              <w:t>25.94 ms</w:t>
+            </w:r>
+          </w:p>
+        </w:tc>
+      </w:tr>
+      <w:tr>
+        <w:tc>
+          <w:tcPr>
+            <w:tcW w:type="dxa" w:w="3216"/>
+          </w:tcPr>
+          <w:p>
+            <w:r>
+              <w:rPr>
+                <w:rFonts w:ascii="Arial" w:hAnsi="Arial"/>
+                <w:b/>
+                <w:sz w:val="19"/>
+              </w:rPr>
+              <w:t>Synchronized shared counter</w:t>
             </w:r>
           </w:p>
         </w:tc>
         <w:tc>
           <w:tcPr>
-            <w:tcW w:type="dxa" w:w="2340"/>
+            <w:tcW w:type="dxa" w:w="3216"/>
           </w:tcPr>
           <w:p>
             <w:r>
@@ -749,23 +1094,21 @@
                 <w:rFonts w:ascii="Arial" w:hAnsi="Arial"/>
                 <w:sz w:val="19"/>
               </w:rPr>
-              <w:t>15.84 ns / op</w:t>
+              <w:t>0.49 ms</w:t>
             </w:r>
           </w:p>
         </w:tc>
         <w:tc>
           <w:tcPr>
-            <w:tcW w:type="dxa" w:w="2340"/>
+            <w:tcW w:type="dxa" w:w="3216"/>
           </w:tcPr>
           <w:p>
             <w:r>
               <w:rPr>
                 <w:rFonts w:ascii="Arial" w:hAnsi="Arial"/>
-                <w:b/>
-                <w:color w:val="27AE60"/>
                 <w:sz w:val="19"/>
               </w:rPr>
-              <w:t>Mini-Thread is ~1.4x Faster</w:t>
+              <w:t>0.68 ms</w:t>
             </w:r>
           </w:p>
         </w:tc>
@@ -773,59 +1116,46 @@
       <w:tr>
         <w:tc>
           <w:tcPr>
-            <w:tcW w:type="dxa" w:w="2340"/>
-          </w:tcPr>
-          <w:p>
-            <w:r>
-              <w:rPr>
-                <w:rFonts w:ascii="Arial" w:hAnsi="Arial"/>
-                <w:sz w:val="19"/>
-              </w:rPr>
-              <w:t>Context Switch Latency (50k yields)</w:t>
-            </w:r>
-          </w:p>
-        </w:tc>
-        <w:tc>
-          <w:tcPr>
-            <w:tcW w:type="dxa" w:w="2340"/>
-          </w:tcPr>
-          <w:p>
-            <w:r>
-              <w:rPr>
-                <w:rFonts w:ascii="Arial" w:hAnsi="Arial"/>
-                <w:sz w:val="19"/>
-              </w:rPr>
-              <w:t>902.82 ns (User space)</w:t>
-            </w:r>
-          </w:p>
-        </w:tc>
-        <w:tc>
-          <w:tcPr>
-            <w:tcW w:type="dxa" w:w="2340"/>
-          </w:tcPr>
-          <w:p>
-            <w:r>
-              <w:rPr>
-                <w:rFonts w:ascii="Arial" w:hAnsi="Arial"/>
-                <w:sz w:val="19"/>
-              </w:rPr>
-              <w:t>System Call Trap Latency</w:t>
-            </w:r>
-          </w:p>
-        </w:tc>
-        <w:tc>
-          <w:tcPr>
-            <w:tcW w:type="dxa" w:w="2340"/>
+            <w:tcW w:type="dxa" w:w="3216"/>
           </w:tcPr>
           <w:p>
             <w:r>
               <w:rPr>
                 <w:rFonts w:ascii="Arial" w:hAnsi="Arial"/>
                 <w:b/>
-                <w:color w:val="27AE60"/>
                 <w:sz w:val="19"/>
               </w:rPr>
-              <w:t>Zero Kernel Traps</w:t>
+              <w:t>Total execution time</w:t>
+            </w:r>
+          </w:p>
+        </w:tc>
+        <w:tc>
+          <w:tcPr>
+            <w:tcW w:type="dxa" w:w="3216"/>
+          </w:tcPr>
+          <w:p>
+            <w:r>
+              <w:rPr>
+                <w:rFonts w:ascii="Arial" w:hAnsi="Arial"/>
+                <w:b/>
+                <w:sz w:val="19"/>
+              </w:rPr>
+              <w:t>87.19 ms</w:t>
+            </w:r>
+          </w:p>
+        </w:tc>
+        <w:tc>
+          <w:tcPr>
+            <w:tcW w:type="dxa" w:w="3216"/>
+          </w:tcPr>
+          <w:p>
+            <w:r>
+              <w:rPr>
+                <w:rFonts w:ascii="Arial" w:hAnsi="Arial"/>
+                <w:b/>
+                <w:sz w:val="19"/>
+              </w:rPr>
+              <w:t>34.84 ms</w:t>
             </w:r>
           </w:p>
         </w:tc>
@@ -833,22 +1163,22 @@
     </w:tbl>
     <w:p>
       <w:pPr>
-        <w:spacing w:after="240"/>
+        <w:spacing w:after="200"/>
       </w:pPr>
     </w:p>
     <w:p>
       <w:pPr>
         <w:pStyle w:val="Heading2"/>
-        <w:spacing w:before="280" w:after="80"/>
+        <w:spacing w:before="240" w:after="60"/>
       </w:pPr>
       <w:r>
         <w:rPr>
           <w:rFonts w:ascii="Arial" w:hAnsi="Arial"/>
           <w:b/>
           <w:color w:val="2C3E50"/>
-          <w:sz w:val="26"/>
+          <w:sz w:val="24"/>
         </w:rPr>
-        <w:t>4.1 Graphical Performance Comparison</w:t>
+        <w:t>10.1 Benchmark Visual Comparison Chart</w:t>
       </w:r>
     </w:p>
     <w:p>
@@ -900,142 +1230,63 @@
           <w:i/>
           <w:sz w:val="18"/>
         </w:rPr>
-        <w:t>Figure 1: Empirical Benchmark Comparison — Thread Creation and Mutex Overhead</w:t>
+        <w:t>Figure 1: Empirical Benchmark Comparison — Thread Creation Latency &amp; Mutex Overhead</w:t>
       </w:r>
     </w:p>
     <w:p>
       <w:pPr>
-        <w:pStyle w:val="Heading1"/>
-        <w:spacing w:before="280" w:after="80"/>
+        <w:pStyle w:val="Heading2"/>
+        <w:spacing w:before="240" w:after="60"/>
       </w:pPr>
       <w:r>
         <w:rPr>
           <w:rFonts w:ascii="Arial" w:hAnsi="Arial"/>
           <w:b/>
-          <w:color w:val="1A5276"/>
-          <w:sz w:val="32"/>
+          <w:color w:val="2C3E50"/>
+          <w:sz w:val="24"/>
         </w:rPr>
-        <w:t>5. Architectural Analysis &amp; Trade-Offs</w:t>
+        <w:t>10.2 Empirical Analysis and Architectural Insights</w:t>
       </w:r>
     </w:p>
     <w:p>
       <w:pPr>
-        <w:spacing w:after="120" w:line="276" w:lineRule="auto"/>
+        <w:spacing w:after="100" w:line="276" w:lineRule="auto"/>
       </w:pPr>
       <w:r>
         <w:rPr>
           <w:rFonts w:ascii="Arial" w:hAnsi="Arial"/>
-          <w:b/>
-          <w:sz w:val="21"/>
+          <w:sz w:val="20"/>
         </w:rPr>
-        <w:t xml:space="preserve">Key Finding 1: Creation Speedup. </w:t>
-      </w:r>
-      <w:r>
-        <w:rPr>
-          <w:rFonts w:ascii="Arial" w:hAnsi="Arial"/>
-          <w:sz w:val="21"/>
-        </w:rPr>
-        <w:t>The benchmark data demonstrates fundamental operating system principles:</w:t>
+        <w:t>1. Thread Creation Advantage: The user-level library completed 500 thread creations and joins in 0.85 ms compared to 8.23 ms for POSIX threads (~9.7x speedup). This occurs because mt_create() allocates a user stack and configures registers directly in user memory, avoiding kernel traps, task_struct allocations, and OS scheduler registration.</w:t>
       </w:r>
     </w:p>
     <w:p>
       <w:pPr>
-        <w:spacing w:after="120" w:line="276" w:lineRule="auto"/>
+        <w:spacing w:after="100" w:line="276" w:lineRule="auto"/>
       </w:pPr>
       <w:r>
         <w:rPr>
           <w:rFonts w:ascii="Arial" w:hAnsi="Arial"/>
-          <w:sz w:val="21"/>
+          <w:sz w:val="20"/>
         </w:rPr>
-        <w:t>User-level threads allocate memory and initialize registers entirely in user space. Conversely, POSIX pthread_create() invokes the Linux clone() system call, creating a kernel task_struct, allocating a separate kernel stack, and updating OS scheduler queues, introducing 7.9x higher creation latency.</w:t>
+        <w:t>2. Thread Handoff Trade-off: Repeated cooperating yields required 85.85 ms in the user library vs 25.94 ms in POSIX pthreads. In POSIX pthreads on modern kernels, cooperative yields on multicore architectures can execute concurrently across hardware cores, whereas our M:1 user-level thread model executes on a single hardware core, interleaving sequentially.</w:t>
       </w:r>
     </w:p>
     <w:p>
       <w:pPr>
-        <w:spacing w:after="120" w:line="276" w:lineRule="auto"/>
+        <w:spacing w:after="100" w:line="276" w:lineRule="auto"/>
       </w:pPr>
       <w:r>
         <w:rPr>
           <w:rFonts w:ascii="Arial" w:hAnsi="Arial"/>
-          <w:b/>
-          <w:sz w:val="21"/>
+          <w:sz w:val="20"/>
         </w:rPr>
-        <w:t xml:space="preserve">Key Finding 2: Trade-Offs. </w:t>
-      </w:r>
-      <w:r>
-        <w:rPr>
-          <w:rFonts w:ascii="Arial" w:hAnsi="Arial"/>
-          <w:sz w:val="21"/>
-        </w:rPr>
-        <w:t>While user-level threads provide ultra-low overhead, the M:1 model has trade-offs: all user threads share a single OS process thread, meaning they cannot achieve multi-core hardware parallelism, and any unhandled blocking I/O call halts the entire library process. POSIX threads utilize true multi-core hardware execution.</w:t>
-      </w:r>
-    </w:p>
-    <w:p>
-      <w:pPr>
-        <w:pStyle w:val="Heading1"/>
-        <w:spacing w:before="280" w:after="80"/>
-      </w:pPr>
-      <w:r>
-        <w:rPr>
-          <w:rFonts w:ascii="Arial" w:hAnsi="Arial"/>
-          <w:b/>
-          <w:color w:val="1A5276"/>
-          <w:sz w:val="32"/>
-        </w:rPr>
-        <w:t>6. Verification &amp; Demonstration Suites</w:t>
-      </w:r>
-    </w:p>
-    <w:p>
-      <w:pPr>
-        <w:spacing w:after="120" w:line="276" w:lineRule="auto"/>
-      </w:pPr>
-      <w:r>
-        <w:rPr>
-          <w:rFonts w:ascii="Arial" w:hAnsi="Arial"/>
-          <w:sz w:val="21"/>
-        </w:rPr>
-        <w:t>1. Preemption Demo (demos/preemption_demo.c): Three CPU-bound threads executing long busy-loops are automatically preempted upon timer expiration, proving time-slice fairness without voluntary mt_yield() calls.</w:t>
-      </w:r>
-    </w:p>
-    <w:p>
-      <w:pPr>
-        <w:spacing w:after="120" w:line="276" w:lineRule="auto"/>
-      </w:pPr>
-      <w:r>
-        <w:rPr>
-          <w:rFonts w:ascii="Arial" w:hAnsi="Arial"/>
-          <w:sz w:val="21"/>
-        </w:rPr>
-        <w:t>2. Race Condition Demo (demos/race_condition.c): Demonstrates counter corruption (expected 10, actual 5) due to interleaved execution without locks, and 100% correctness (10/10) when protected by mt_mutex_t.</w:t>
-      </w:r>
-    </w:p>
-    <w:p>
-      <w:pPr>
-        <w:spacing w:after="120" w:line="276" w:lineRule="auto"/>
-      </w:pPr>
-      <w:r>
-        <w:rPr>
-          <w:rFonts w:ascii="Arial" w:hAnsi="Arial"/>
-          <w:sz w:val="21"/>
-        </w:rPr>
-        <w:t>3. Producer-Consumer Demo (demos/producer_consumer.c): Demonstrates bounded buffer coordination using counting semaphores and mutex protection without buffer underflows or overflows.</w:t>
-      </w:r>
-    </w:p>
-    <w:p>
-      <w:pPr>
-        <w:spacing w:after="120" w:line="276" w:lineRule="auto"/>
-      </w:pPr>
-      <w:r>
-        <w:rPr>
-          <w:rFonts w:ascii="Arial" w:hAnsi="Arial"/>
-          <w:sz w:val="21"/>
-        </w:rPr>
-        <w:t>4. Automated Unit Test Suite (make test): Executes four automated test harnesses validating circular queue bounds, state transitions, blocking APIs, and edge-case argument validation.</w:t>
+        <w:t>3. Mutex Synchronization: Both implementations showed lightweight synchronization for uncontended loops (0.49 ms user vs 0.68 ms POSIX), demonstrating that user-space locks eliminate unnecessary kernel transitions when there is no contention.</w:t>
       </w:r>
     </w:p>
     <w:sectPr>
       <w:pgSz w:w="12240" w:h="15840"/>
-      <w:pgMar w:top="1440" w:right="1440" w:bottom="1440" w:left="1440" w:header="720" w:footer="720" w:gutter="0"/>
+      <w:pgMar w:top="1296" w:right="1296" w:bottom="1296" w:left="1296" w:header="720" w:footer="720" w:gutter="0"/>
       <w:cols w:space="720"/>
       <w:docGrid w:linePitch="360"/>
     </w:sectPr>

</xml_diff>

<commit_message>
Update Word report to include all contiguous sections 1 through 11
</commit_message>
<xml_diff>
--- a/Mini_Thread_Library_Project_Report.docx
+++ b/Mini_Thread_Library_Project_Report.docx
@@ -14,7 +14,7 @@
           <w:color w:val="1A5276"/>
           <w:sz w:val="44"/>
         </w:rPr>
-        <w:t>PROJECT COMPREHENSIVE REPORT</w:t>
+        <w:t>OPERATING SYSTEMS PROJECT REPORT</w:t>
       </w:r>
     </w:p>
     <w:p>
@@ -177,16 +177,16 @@
     <w:p>
       <w:pPr>
         <w:pStyle w:val="Heading1"/>
-        <w:spacing w:before="240" w:after="60"/>
+        <w:spacing w:before="280" w:after="80"/>
       </w:pPr>
       <w:r>
         <w:rPr>
           <w:rFonts w:ascii="Arial" w:hAnsi="Arial"/>
           <w:b/>
           <w:color w:val="1A5276"/>
-          <w:sz w:val="30"/>
+          <w:sz w:val="28"/>
         </w:rPr>
-        <w:t>1. Module Breakdown &amp; Code Ownership per Person</w:t>
+        <w:t>1. Executive Summary &amp; Objectives</w:t>
       </w:r>
     </w:p>
     <w:p>
@@ -198,7 +198,46 @@
           <w:rFonts w:ascii="Arial" w:hAnsi="Arial"/>
           <w:sz w:val="20"/>
         </w:rPr>
-        <w:t>To prevent file conflicts and adhere to modular software architecture, each team member strictly owns specific source files, headers, test suites, and demonstration programs as defined below:</w:t>
+        <w:t>Modern operating systems rely heavily on multi-threading for concurrency and system responsiveness. While standard production libraries (such as POSIX pthreads) execute as 1:1 kernel-level threads, understanding user-level threading (M:1 model) is essential to comprehending context switching overhead, stack isolation, and scheduling mechanics.</w:t>
+      </w:r>
+    </w:p>
+    <w:p>
+      <w:pPr>
+        <w:spacing w:after="100" w:line="276" w:lineRule="auto"/>
+      </w:pPr>
+      <w:r>
+        <w:rPr>
+          <w:rFonts w:ascii="Arial" w:hAnsi="Arial"/>
+          <w:sz w:val="20"/>
+        </w:rPr>
+        <w:t>The objective of this project is to develop a fully functional, preemptive user-level thread library in C from first principles without utilizing pthread_create(). The library implements complete thread lifecycle management, circular FIFO ready queue scheduling, round-robin preemption via hardware interval timers (SIGALRM), mutual exclusion locks, counting semaphores, and an empirical benchmarking framework comparing performance against native POSIX threads.</w:t>
+      </w:r>
+    </w:p>
+    <w:p>
+      <w:pPr>
+        <w:pStyle w:val="Heading1"/>
+        <w:spacing w:before="280" w:after="80"/>
+      </w:pPr>
+      <w:r>
+        <w:rPr>
+          <w:rFonts w:ascii="Arial" w:hAnsi="Arial"/>
+          <w:b/>
+          <w:color w:val="1A5276"/>
+          <w:sz w:val="28"/>
+        </w:rPr>
+        <w:t>2. Team Division &amp; Code Ownership Breakdown</w:t>
+      </w:r>
+    </w:p>
+    <w:p>
+      <w:pPr>
+        <w:spacing w:after="100" w:line="276" w:lineRule="auto"/>
+      </w:pPr>
+      <w:r>
+        <w:rPr>
+          <w:rFonts w:ascii="Arial" w:hAnsi="Arial"/>
+          <w:sz w:val="20"/>
+        </w:rPr>
+        <w:t>To prevent file conflicts and adhere to professional modular software architecture, each team member strictly owns specific source files, headers, test suites, and demonstration programs as defined below:</w:t>
       </w:r>
     </w:p>
     <w:tbl>
@@ -278,7 +317,7 @@
                 <w:color w:val="FFFFFF"/>
                 <w:sz w:val="19"/>
               </w:rPr>
-              <w:t>Test / Demo Programs</w:t>
+              <w:t>Test / Demo Programs Owned</w:t>
             </w:r>
           </w:p>
         </w:tc>
@@ -497,22 +536,22 @@
     </w:tbl>
     <w:p>
       <w:pPr>
-        <w:spacing w:after="160"/>
+        <w:spacing w:after="120"/>
       </w:pPr>
     </w:p>
     <w:p>
       <w:pPr>
-        <w:pStyle w:val="Heading2"/>
-        <w:spacing w:before="240" w:after="60"/>
+        <w:pStyle w:val="Heading1"/>
+        <w:spacing w:before="280" w:after="80"/>
       </w:pPr>
       <w:r>
         <w:rPr>
           <w:rFonts w:ascii="Arial" w:hAnsi="Arial"/>
           <w:b/>
-          <w:color w:val="2C3E50"/>
-          <w:sz w:val="24"/>
+          <w:color w:val="1A5276"/>
+          <w:sz w:val="28"/>
         </w:rPr>
-        <w:t>1.1 Individual Code Functions and Interfaces</w:t>
+        <w:t>3. System Architecture &amp; Thread Control Block</w:t>
       </w:r>
     </w:p>
     <w:p>
@@ -524,7 +563,7 @@
           <w:rFonts w:ascii="Arial" w:hAnsi="Arial"/>
           <w:sz w:val="20"/>
         </w:rPr>
-        <w:t>• Person 1 (src/thread.c, src/queue.c): Implemented mt_init(), mt_create(), mt_yield(), mt_exit(), mt_join(), and the circular FIFO ready queue (mt_queue_push, mt_queue_pop). Manages Thread Control Blocks (TCB), thread state transitions (READY, RUNNING, BLOCKED, TERMINATED), 64 KB stack allocations, and deferred stack reclamation.</w:t>
+        <w:t>The library adopts the M:1 User-Level Threading model, where multiple user threads map to a single operating system process. The internal structure is governed by the Thread Control Block (TCB):</w:t>
       </w:r>
     </w:p>
     <w:p>
@@ -536,7 +575,7 @@
           <w:rFonts w:ascii="Arial" w:hAnsi="Arial"/>
           <w:sz w:val="20"/>
         </w:rPr>
-        <w:t>• Person 2 (src/sched.c, src/timer.c): Implemented Round-Robin policy (sched_init, sched_tick, sched_set_quantum) and preemption using setitimer(ITIMER_REAL) generating SIGALRM every 10 ms. Protects atomic context switches via timer_block_signals() (sigprocmask).</w:t>
+        <w:t>• Thread Identifier (id): Unique integer (0 to MAX_THREADS-1). Thread 0 represents the main thread.</w:t>
       </w:r>
     </w:p>
     <w:p>
@@ -548,20 +587,383 @@
           <w:rFonts w:ascii="Arial" w:hAnsi="Arial"/>
           <w:sz w:val="20"/>
         </w:rPr>
-        <w:t>• Person 3 (src/sync.c): Implemented mutual exclusion locks (mt_mutex_init, mt_mutex_lock, mt_mutex_unlock) and counting semaphores (mt_sem_init, mt_sem_wait, mt_sem_post). Built demonstration harnesses showing unsynchronized race condition data loss vs synchronized consistency.</w:t>
+        <w:t>• Thread State (state): Tracks whether the thread is READY, RUNNING, BLOCKED, or TERMINATED.</w:t>
+      </w:r>
+    </w:p>
+    <w:p>
+      <w:pPr>
+        <w:spacing w:after="100" w:line="276" w:lineRule="auto"/>
+      </w:pPr>
+      <w:r>
+        <w:rPr>
+          <w:rFonts w:ascii="Arial" w:hAnsi="Arial"/>
+          <w:sz w:val="20"/>
+        </w:rPr>
+        <w:t>• Dedicated Stack (stack): Each thread receives an isolated 64 KB user-space memory stack allocated via malloc().</w:t>
+      </w:r>
+    </w:p>
+    <w:p>
+      <w:pPr>
+        <w:spacing w:after="100" w:line="276" w:lineRule="auto"/>
+      </w:pPr>
+      <w:r>
+        <w:rPr>
+          <w:rFonts w:ascii="Arial" w:hAnsi="Arial"/>
+          <w:sz w:val="20"/>
+        </w:rPr>
+        <w:t>• Execution Context (context): System V ucontext_t capturing CPU registers (Stack Pointer, Program Counter, general registers).</w:t>
+      </w:r>
+    </w:p>
+    <w:p>
+      <w:pPr>
+        <w:spacing w:after="100" w:line="276" w:lineRule="auto"/>
+      </w:pPr>
+      <w:r>
+        <w:rPr>
+          <w:rFonts w:ascii="Arial" w:hAnsi="Arial"/>
+          <w:sz w:val="20"/>
+        </w:rPr>
+        <w:t>• Deferred Stack Cleanup: Avoids freeing active stacks during mt_exit() by deferring stack deallocation until the next context switch occurs.</w:t>
       </w:r>
     </w:p>
     <w:p>
       <w:pPr>
         <w:pStyle w:val="Heading1"/>
-        <w:spacing w:before="240" w:after="60"/>
+        <w:spacing w:before="280" w:after="80"/>
       </w:pPr>
       <w:r>
         <w:rPr>
           <w:rFonts w:ascii="Arial" w:hAnsi="Arial"/>
           <w:b/>
           <w:color w:val="1A5276"/>
-          <w:sz w:val="30"/>
+          <w:sz w:val="28"/>
+        </w:rPr>
+        <w:t>4. Ready Queue Implementation</w:t>
+      </w:r>
+    </w:p>
+    <w:p>
+      <w:pPr>
+        <w:spacing w:after="100" w:line="276" w:lineRule="auto"/>
+      </w:pPr>
+      <w:r>
+        <w:rPr>
+          <w:rFonts w:ascii="Arial" w:hAnsi="Arial"/>
+          <w:sz w:val="20"/>
+        </w:rPr>
+        <w:t>Thread scheduling relies on an efficient, fixed-capacity circular FIFO queue (src/queue.c):</w:t>
+      </w:r>
+    </w:p>
+    <w:p>
+      <w:pPr>
+        <w:spacing w:after="100" w:line="276" w:lineRule="auto"/>
+      </w:pPr>
+      <w:r>
+        <w:rPr>
+          <w:rFonts w:ascii="Arial" w:hAnsi="Arial"/>
+          <w:sz w:val="20"/>
+        </w:rPr>
+        <w:t>• mt_queue_push(thread_id): Appends a thread to the rear of the queue in O(1) time complexity.</w:t>
+      </w:r>
+    </w:p>
+    <w:p>
+      <w:pPr>
+        <w:spacing w:after="100" w:line="276" w:lineRule="auto"/>
+      </w:pPr>
+      <w:r>
+        <w:rPr>
+          <w:rFonts w:ascii="Arial" w:hAnsi="Arial"/>
+          <w:sz w:val="20"/>
+        </w:rPr>
+        <w:t>• mt_queue_pop(): Dequeues the front thread in O(1) time complexity, returning -1 if empty.</w:t>
+      </w:r>
+    </w:p>
+    <w:p>
+      <w:pPr>
+        <w:spacing w:after="100" w:line="276" w:lineRule="auto"/>
+      </w:pPr>
+      <w:r>
+        <w:rPr>
+          <w:rFonts w:ascii="Arial" w:hAnsi="Arial"/>
+          <w:sz w:val="20"/>
+        </w:rPr>
+        <w:t>• Circular Wrap-Around: Modulo arithmetic ((rear + 1) % MAX_QUEUE_SIZE) prevents queue starvation or memory fragmentation.</w:t>
+      </w:r>
+    </w:p>
+    <w:p>
+      <w:pPr>
+        <w:pStyle w:val="Heading1"/>
+        <w:spacing w:before="280" w:after="80"/>
+      </w:pPr>
+      <w:r>
+        <w:rPr>
+          <w:rFonts w:ascii="Arial" w:hAnsi="Arial"/>
+          <w:b/>
+          <w:color w:val="1A5276"/>
+          <w:sz w:val="28"/>
+        </w:rPr>
+        <w:t>5. Context Switching Mechanics</w:t>
+      </w:r>
+    </w:p>
+    <w:p>
+      <w:pPr>
+        <w:spacing w:after="100" w:line="276" w:lineRule="auto"/>
+      </w:pPr>
+      <w:r>
+        <w:rPr>
+          <w:rFonts w:ascii="Arial" w:hAnsi="Arial"/>
+          <w:sz w:val="20"/>
+        </w:rPr>
+        <w:t>Context switching is executed entirely in user space without issuing kernel traps:</w:t>
+      </w:r>
+    </w:p>
+    <w:p>
+      <w:pPr>
+        <w:spacing w:after="100" w:line="276" w:lineRule="auto"/>
+      </w:pPr>
+      <w:r>
+        <w:rPr>
+          <w:rFonts w:ascii="Arial" w:hAnsi="Arial"/>
+          <w:sz w:val="20"/>
+        </w:rPr>
+        <w:t>1. Thread Initialization: getcontext() initializes the context, makecontext() binds the target function, arguments, and stack.</w:t>
+      </w:r>
+    </w:p>
+    <w:p>
+      <w:pPr>
+        <w:spacing w:after="100" w:line="276" w:lineRule="auto"/>
+      </w:pPr>
+      <w:r>
+        <w:rPr>
+          <w:rFonts w:ascii="Arial" w:hAnsi="Arial"/>
+          <w:sz w:val="20"/>
+        </w:rPr>
+        <w:t>2. Voluntary Yielding (mt_yield): The running thread changes state from RUNNING to READY, is re-enqueued, and swapcontext(&amp;previous, &amp;next) transfers CPU registers directly to the next ready thread.</w:t>
+      </w:r>
+    </w:p>
+    <w:p>
+      <w:pPr>
+        <w:spacing w:after="100" w:line="276" w:lineRule="auto"/>
+      </w:pPr>
+      <w:r>
+        <w:rPr>
+          <w:rFonts w:ascii="Arial" w:hAnsi="Arial"/>
+          <w:sz w:val="20"/>
+        </w:rPr>
+        <w:t>3. Clean Exit (mt_exit): Marks the thread TERMINATED, frees deferred resources, and setcontext(&amp;next) switches to the next thread.</w:t>
+      </w:r>
+    </w:p>
+    <w:p>
+      <w:pPr>
+        <w:pStyle w:val="Heading1"/>
+        <w:spacing w:before="280" w:after="80"/>
+      </w:pPr>
+      <w:r>
+        <w:rPr>
+          <w:rFonts w:ascii="Arial" w:hAnsi="Arial"/>
+          <w:b/>
+          <w:color w:val="1A5276"/>
+          <w:sz w:val="28"/>
+        </w:rPr>
+        <w:t>6. Scheduling &amp; Preemption Design</w:t>
+      </w:r>
+    </w:p>
+    <w:p>
+      <w:pPr>
+        <w:spacing w:after="100" w:line="276" w:lineRule="auto"/>
+      </w:pPr>
+      <w:r>
+        <w:rPr>
+          <w:rFonts w:ascii="Arial" w:hAnsi="Arial"/>
+          <w:sz w:val="20"/>
+        </w:rPr>
+        <w:t>To prevent compute-bound threads from monopolizing the CPU, Person 2 implemented preemptive scheduling:</w:t>
+      </w:r>
+    </w:p>
+    <w:p>
+      <w:pPr>
+        <w:spacing w:after="100" w:line="276" w:lineRule="auto"/>
+      </w:pPr>
+      <w:r>
+        <w:rPr>
+          <w:rFonts w:ascii="Arial" w:hAnsi="Arial"/>
+          <w:sz w:val="20"/>
+        </w:rPr>
+        <w:t>• Round-Robin Policy: Threads execute for a maximum time slice (time quantum = 10 ms).</w:t>
+      </w:r>
+    </w:p>
+    <w:p>
+      <w:pPr>
+        <w:spacing w:after="100" w:line="276" w:lineRule="auto"/>
+      </w:pPr>
+      <w:r>
+        <w:rPr>
+          <w:rFonts w:ascii="Arial" w:hAnsi="Arial"/>
+          <w:sz w:val="20"/>
+        </w:rPr>
+        <w:t>• Hardware Interval Timer: Configured via setitimer(ITIMER_REAL, ...), triggering periodic SIGALRM interrupts.</w:t>
+      </w:r>
+    </w:p>
+    <w:p>
+      <w:pPr>
+        <w:spacing w:after="100" w:line="276" w:lineRule="auto"/>
+      </w:pPr>
+      <w:r>
+        <w:rPr>
+          <w:rFonts w:ascii="Arial" w:hAnsi="Arial"/>
+          <w:sz w:val="20"/>
+        </w:rPr>
+        <w:t>• Signal Handler (sched_tick): Traps SIGALRM and initiates a thread switch.</w:t>
+      </w:r>
+    </w:p>
+    <w:p>
+      <w:pPr>
+        <w:spacing w:after="100" w:line="276" w:lineRule="auto"/>
+      </w:pPr>
+      <w:r>
+        <w:rPr>
+          <w:rFonts w:ascii="Arial" w:hAnsi="Arial"/>
+          <w:sz w:val="20"/>
+        </w:rPr>
+        <w:t>• Signal Masking (sigprocmask): SIGALRM is temporarily blocked during queue manipulation and context switches to eliminate race conditions and corrupted register states.</w:t>
+      </w:r>
+    </w:p>
+    <w:p>
+      <w:pPr>
+        <w:pStyle w:val="Heading1"/>
+        <w:spacing w:before="280" w:after="80"/>
+      </w:pPr>
+      <w:r>
+        <w:rPr>
+          <w:rFonts w:ascii="Arial" w:hAnsi="Arial"/>
+          <w:b/>
+          <w:color w:val="1A5276"/>
+          <w:sz w:val="28"/>
+        </w:rPr>
+        <w:t>7. Synchronization Primitives</w:t>
+      </w:r>
+    </w:p>
+    <w:p>
+      <w:pPr>
+        <w:spacing w:after="100" w:line="276" w:lineRule="auto"/>
+      </w:pPr>
+      <w:r>
+        <w:rPr>
+          <w:rFonts w:ascii="Arial" w:hAnsi="Arial"/>
+          <w:sz w:val="20"/>
+        </w:rPr>
+        <w:t>To support safe multi-threaded concurrency, Person 3 implemented two core primitives:</w:t>
+      </w:r>
+    </w:p>
+    <w:p>
+      <w:pPr>
+        <w:spacing w:after="100" w:line="276" w:lineRule="auto"/>
+      </w:pPr>
+      <w:r>
+        <w:rPr>
+          <w:rFonts w:ascii="Arial" w:hAnsi="Arial"/>
+          <w:sz w:val="20"/>
+        </w:rPr>
+        <w:t>• Mutex (mt_mutex_t): Binary mutual exclusion lock. If locked, subsequent threads block or yield until unlocked, ensuring that critical section invariants are preserved.</w:t>
+      </w:r>
+    </w:p>
+    <w:p>
+      <w:pPr>
+        <w:spacing w:after="100" w:line="276" w:lineRule="auto"/>
+      </w:pPr>
+      <w:r>
+        <w:rPr>
+          <w:rFonts w:ascii="Arial" w:hAnsi="Arial"/>
+          <w:sz w:val="20"/>
+        </w:rPr>
+        <w:t>• Counting Semaphore (mt_sem_t): Maintains an integer token counter. mt_sem_wait() decrements the counter (blocking if &lt;= 0), and mt_sem_post() increments the counter, waking blocked threads.</w:t>
+      </w:r>
+    </w:p>
+    <w:p>
+      <w:pPr>
+        <w:pStyle w:val="Heading1"/>
+        <w:spacing w:before="280" w:after="80"/>
+      </w:pPr>
+      <w:r>
+        <w:rPr>
+          <w:rFonts w:ascii="Arial" w:hAnsi="Arial"/>
+          <w:b/>
+          <w:color w:val="1A5276"/>
+          <w:sz w:val="28"/>
+        </w:rPr>
+        <w:t>8. GitHub Team Workflow &amp; Clean Integration</w:t>
+      </w:r>
+    </w:p>
+    <w:p>
+      <w:pPr>
+        <w:spacing w:after="100" w:line="276" w:lineRule="auto"/>
+      </w:pPr>
+      <w:r>
+        <w:rPr>
+          <w:rFonts w:ascii="Arial" w:hAnsi="Arial"/>
+          <w:sz w:val="20"/>
+        </w:rPr>
+        <w:t>The team followed strict Git collaborative engineering rules:</w:t>
+      </w:r>
+    </w:p>
+    <w:p>
+      <w:pPr>
+        <w:spacing w:after="100" w:line="276" w:lineRule="auto"/>
+      </w:pPr>
+      <w:r>
+        <w:rPr>
+          <w:rFonts w:ascii="Arial" w:hAnsi="Arial"/>
+          <w:sz w:val="20"/>
+        </w:rPr>
+        <w:t>• Person 1 branched to person1-thread-management, Person 2 to person2-scheduling, and Person 3 to person3-synchronization.</w:t>
+      </w:r>
+    </w:p>
+    <w:p>
+      <w:pPr>
+        <w:spacing w:after="100" w:line="276" w:lineRule="auto"/>
+      </w:pPr>
+      <w:r>
+        <w:rPr>
+          <w:rFonts w:ascii="Arial" w:hAnsi="Arial"/>
+          <w:sz w:val="20"/>
+        </w:rPr>
+        <w:t>• Rule 6 compliance: include/mthread.h was strictly owned by Person 1 to avoid merge conflicts.</w:t>
+      </w:r>
+    </w:p>
+    <w:p>
+      <w:pPr>
+        <w:spacing w:after="100" w:line="276" w:lineRule="auto"/>
+      </w:pPr>
+      <w:r>
+        <w:rPr>
+          <w:rFonts w:ascii="Arial" w:hAnsi="Arial"/>
+          <w:sz w:val="20"/>
+        </w:rPr>
+        <w:t>• Small, descriptive commits were pushed incrementally.</w:t>
+      </w:r>
+    </w:p>
+    <w:p>
+      <w:pPr>
+        <w:spacing w:after="100" w:line="276" w:lineRule="auto"/>
+      </w:pPr>
+      <w:r>
+        <w:rPr>
+          <w:rFonts w:ascii="Arial" w:hAnsi="Arial"/>
+          <w:sz w:val="20"/>
+        </w:rPr>
+        <w:t>• All three branches were cleanly merged into main, validated against the full regression test suite, and deployed.</w:t>
+      </w:r>
+    </w:p>
+    <w:p>
+      <w:pPr>
+        <w:pStyle w:val="Heading1"/>
+        <w:spacing w:before="280" w:after="80"/>
+      </w:pPr>
+      <w:r>
+        <w:rPr>
+          <w:rFonts w:ascii="Arial" w:hAnsi="Arial"/>
+          <w:b/>
+          <w:color w:val="1A5276"/>
+          <w:sz w:val="28"/>
         </w:rPr>
         <w:t>9. Testing and Demonstration</w:t>
       </w:r>
@@ -888,14 +1290,14 @@
     <w:p>
       <w:pPr>
         <w:pStyle w:val="Heading1"/>
-        <w:spacing w:before="240" w:after="60"/>
+        <w:spacing w:before="280" w:after="80"/>
       </w:pPr>
       <w:r>
         <w:rPr>
           <w:rFonts w:ascii="Arial" w:hAnsi="Arial"/>
           <w:b/>
           <w:color w:val="1A5276"/>
-          <w:sz w:val="30"/>
+          <w:sz w:val="28"/>
         </w:rPr>
         <w:t>10. Performance Comparison with POSIX Threads</w:t>
       </w:r>
@@ -1169,14 +1571,14 @@
     <w:p>
       <w:pPr>
         <w:pStyle w:val="Heading2"/>
-        <w:spacing w:before="240" w:after="60"/>
+        <w:spacing w:before="200" w:after="60"/>
       </w:pPr>
       <w:r>
         <w:rPr>
           <w:rFonts w:ascii="Arial" w:hAnsi="Arial"/>
           <w:b/>
           <w:color w:val="2C3E50"/>
-          <w:sz w:val="24"/>
+          <w:sz w:val="23"/>
         </w:rPr>
         <w:t>10.1 Benchmark Visual Comparison Chart</w:t>
       </w:r>
@@ -1230,22 +1632,22 @@
           <w:i/>
           <w:sz w:val="18"/>
         </w:rPr>
-        <w:t>Figure 1: Empirical Benchmark Comparison — Thread Creation Latency &amp; Mutex Overhead</w:t>
+        <w:t>Figure 1: Measured Latency — Thread Creation &amp; Termination vs. Mutex Overhead</w:t>
       </w:r>
     </w:p>
     <w:p>
       <w:pPr>
-        <w:pStyle w:val="Heading2"/>
-        <w:spacing w:before="240" w:after="60"/>
+        <w:pStyle w:val="Heading1"/>
+        <w:spacing w:before="280" w:after="80"/>
       </w:pPr>
       <w:r>
         <w:rPr>
           <w:rFonts w:ascii="Arial" w:hAnsi="Arial"/>
           <w:b/>
-          <w:color w:val="2C3E50"/>
-          <w:sz w:val="24"/>
+          <w:color w:val="1A5276"/>
+          <w:sz w:val="28"/>
         </w:rPr>
-        <w:t>10.2 Empirical Analysis and Architectural Insights</w:t>
+        <w:t>11. Architectural Analysis &amp; Conclusion</w:t>
       </w:r>
     </w:p>
     <w:p>
@@ -1282,6 +1684,18 @@
           <w:sz w:val="20"/>
         </w:rPr>
         <w:t>3. Mutex Synchronization: Both implementations showed lightweight synchronization for uncontended loops (0.49 ms user vs 0.68 ms POSIX), demonstrating that user-space locks eliminate unnecessary kernel transitions when there is no contention.</w:t>
+      </w:r>
+    </w:p>
+    <w:p>
+      <w:pPr>
+        <w:spacing w:after="100" w:line="276" w:lineRule="auto"/>
+      </w:pPr>
+      <w:r>
+        <w:rPr>
+          <w:rFonts w:ascii="Arial" w:hAnsi="Arial"/>
+          <w:sz w:val="20"/>
+        </w:rPr>
+        <w:t>In conclusion, the project successfully demonstrates the foundational principles of operating system threading, illustrating why user-space fibers/coroutines provide extreme performance for lightweight I/O and task dispatching, while kernel threads provide true hardware multi-core parallelism.</w:t>
       </w:r>
     </w:p>
     <w:sectPr>

</xml_diff>

<commit_message>
Add equivalent POSIX reference workload suite and update Review I topic title
</commit_message>
<xml_diff>
--- a/Mini_Thread_Library_Project_Report.docx
+++ b/Mini_Thread_Library_Project_Report.docx
@@ -12,9 +12,9 @@
           <w:rFonts w:ascii="Arial" w:hAnsi="Arial"/>
           <w:b/>
           <w:color w:val="1A5276"/>
-          <w:sz w:val="44"/>
+          <w:sz w:val="36"/>
         </w:rPr>
-        <w:t>OPERATING SYSTEMS PROJECT REPORT</w:t>
+        <w:t>MicroThreads: A User-Level Threading Library with Pluggable Pre-emptive Scheduling and Synchronization Primitives, Benchmarked Against POSIX Threads</w:t>
       </w:r>
     </w:p>
     <w:p>
@@ -29,9 +29,7 @@
           <w:color w:val="2C3E50"/>
           <w:sz w:val="26"/>
         </w:rPr>
-        <w:t>Design, Implementation, Verification &amp; Empirical POSIX Benchmarking</w:t>
-        <w:br/>
-        <w:t>of an M:1 Preemptive User-Level Thread Library in C</w:t>
+        <w:t>Operating Systems Lab — Review I Project Report</w:t>
       </w:r>
     </w:p>
     <w:tbl>

</xml_diff>